<commit_message>
Update lease parties, remove guarantor, new IBAN
Landlord is now Sukriye Nur Canseven (Kula land registry, Kula/Manisa
address), tenant Adem Yildiz (Atakum/Samsun). Removed all guarantor
fields, the guarantor signature column, and the personal-surety clause
(special conditions now number 12). Updated payment IBAN and left the
lease start date blank to be filled in later.

Co-Authored-By: Claude Fable 5 <noreply@anthropic.com>
Claude-Session: https://claude.ai/code/session_013ftxuMbrdNvqBfQiBmVPB5
</commit_message>
<xml_diff>
--- a/konut-kira-kontrati.docx
+++ b/konut-kira-kontrati.docx
@@ -72,7 +72,7 @@
                 <w:sz w:val="20"/>
                 <w:szCs w:val="20"/>
               </w:rPr>
-              <w:t xml:space="preserve">: ÇİĞLİ</w:t>
+              <w:t xml:space="preserve">: KULA</w:t>
             </w:r>
           </w:p>
         </w:tc>
@@ -215,16 +215,16 @@
                 <w:sz w:val="20"/>
                 <w:szCs w:val="20"/>
               </w:rPr>
-              <w:t xml:space="preserve">: ABDULLAH CANSEVEN</w:t>
-            </w:r>
-          </w:p>
-          <w:p>
-            <w:r>
-              <w:rPr>
-                <w:sz w:val="20"/>
-                <w:szCs w:val="20"/>
-              </w:rPr>
-              <w:t xml:space="preserve">  TC. 59128173264</w:t>
+              <w:t xml:space="preserve">: ŞÜKRİYE NUR CANSEVEN</w:t>
+            </w:r>
+          </w:p>
+          <w:p>
+            <w:r>
+              <w:rPr>
+                <w:sz w:val="20"/>
+                <w:szCs w:val="20"/>
+              </w:rPr>
+              <w:t xml:space="preserve">  TC. 21875415058</w:t>
             </w:r>
           </w:p>
         </w:tc>
@@ -268,7 +268,7 @@
                 <w:sz w:val="20"/>
                 <w:szCs w:val="20"/>
               </w:rPr>
-              <w:t xml:space="preserve">: 05326766012</w:t>
+              <w:t xml:space="preserve">: +90 546 267 2767</w:t>
             </w:r>
           </w:p>
         </w:tc>
@@ -312,7 +312,7 @@
                 <w:sz w:val="20"/>
                 <w:szCs w:val="20"/>
               </w:rPr>
-              <w:t xml:space="preserve">:</w:t>
+              <w:t xml:space="preserve">: 4 EYLÜL MAHALLESİ MUAMMER KELEŞOĞLU SOKAK NO. 142 DAİRE 9 KULA / MANİSA</w:t>
             </w:r>
           </w:p>
         </w:tc>
@@ -356,7 +356,7 @@
                 <w:sz w:val="20"/>
                 <w:szCs w:val="20"/>
               </w:rPr>
-              <w:t xml:space="preserve">: ÖMER ORTAÇ – TC. 40516588142</w:t>
+              <w:t xml:space="preserve">: ADEM YILDIZ – TC. 38143526484</w:t>
             </w:r>
           </w:p>
         </w:tc>
@@ -400,7 +400,7 @@
                 <w:sz w:val="20"/>
                 <w:szCs w:val="20"/>
               </w:rPr>
-              <w:t xml:space="preserve">: 129 SOKAK NO. 1/201 ARTAROĞLU İŞ MERKEZİ EVKA 3 BORNOVA İZMİR – TEL. 05063460335</w:t>
+              <w:t xml:space="preserve">: ATAKENT MAH. 3289. SOKAK NO. 26 K: 4 D: 7 ATAKUM / SAMSUN</w:t>
             </w:r>
           </w:p>
         </w:tc>
@@ -424,7 +424,7 @@
                 <w:sz w:val="20"/>
                 <w:szCs w:val="20"/>
               </w:rPr>
-              <w:t xml:space="preserve">Kefilin Adı, Soyadı</w:t>
+              <w:t xml:space="preserve">Bir Aylık Kira Bedeli</w:t>
             </w:r>
           </w:p>
         </w:tc>
@@ -444,7 +444,7 @@
                 <w:sz w:val="20"/>
                 <w:szCs w:val="20"/>
               </w:rPr>
-              <w:t xml:space="preserve">: CEMRE ORTAÇ</w:t>
+              <w:t xml:space="preserve">: 15.000 TL</w:t>
             </w:r>
           </w:p>
         </w:tc>
@@ -468,7 +468,7 @@
                 <w:sz w:val="20"/>
                 <w:szCs w:val="20"/>
               </w:rPr>
-              <w:t xml:space="preserve">Kefilin Adresi</w:t>
+              <w:t xml:space="preserve">Yıllık Kira Karşılığı</w:t>
             </w:r>
           </w:p>
         </w:tc>
@@ -488,7 +488,7 @@
                 <w:sz w:val="20"/>
                 <w:szCs w:val="20"/>
               </w:rPr>
-              <w:t xml:space="preserve">: VİKİNG PAZARLAMA A.Ş. 519 SOKAK NO. 314/1 35730 KEMALPAŞA İZMİR</w:t>
+              <w:t xml:space="preserve">: 180.000 TL</w:t>
             </w:r>
           </w:p>
         </w:tc>
@@ -512,7 +512,7 @@
                 <w:sz w:val="20"/>
                 <w:szCs w:val="20"/>
               </w:rPr>
-              <w:t xml:space="preserve">Kefilin T.C. Kimlik No</w:t>
+              <w:t xml:space="preserve">Depozito Bedeli</w:t>
             </w:r>
           </w:p>
         </w:tc>
@@ -532,7 +532,7 @@
                 <w:sz w:val="20"/>
                 <w:szCs w:val="20"/>
               </w:rPr>
-              <w:t xml:space="preserve">: 26612328134</w:t>
+              <w:t xml:space="preserve">: 15.000 TL</w:t>
             </w:r>
           </w:p>
         </w:tc>
@@ -556,7 +556,7 @@
                 <w:sz w:val="20"/>
                 <w:szCs w:val="20"/>
               </w:rPr>
-              <w:t xml:space="preserve">Bir Aylık Kira Bedeli</w:t>
+              <w:t xml:space="preserve">Kira Akdinin Başlangıç Tarihi</w:t>
             </w:r>
           </w:p>
         </w:tc>
@@ -576,7 +576,7 @@
                 <w:sz w:val="20"/>
                 <w:szCs w:val="20"/>
               </w:rPr>
-              <w:t xml:space="preserve">: 15.000 TL</w:t>
+              <w:t xml:space="preserve">:</w:t>
             </w:r>
           </w:p>
         </w:tc>
@@ -600,7 +600,7 @@
                 <w:sz w:val="20"/>
                 <w:szCs w:val="20"/>
               </w:rPr>
-              <w:t xml:space="preserve">Yıllık Kira Karşılığı</w:t>
+              <w:t xml:space="preserve">Kira Müddeti</w:t>
             </w:r>
           </w:p>
         </w:tc>
@@ -620,7 +620,7 @@
                 <w:sz w:val="20"/>
                 <w:szCs w:val="20"/>
               </w:rPr>
-              <w:t xml:space="preserve">: 180.000 TL</w:t>
+              <w:t xml:space="preserve">: 1 YIL</w:t>
             </w:r>
           </w:p>
         </w:tc>
@@ -644,7 +644,7 @@
                 <w:sz w:val="20"/>
                 <w:szCs w:val="20"/>
               </w:rPr>
-              <w:t xml:space="preserve">Depozito Bedeli</w:t>
+              <w:t xml:space="preserve">Kullanılanın Şimdiki Durumu</w:t>
             </w:r>
           </w:p>
         </w:tc>
@@ -664,7 +664,7 @@
                 <w:sz w:val="20"/>
                 <w:szCs w:val="20"/>
               </w:rPr>
-              <w:t xml:space="preserve">: 15.000 TL</w:t>
+              <w:t xml:space="preserve">:</w:t>
             </w:r>
           </w:p>
         </w:tc>
@@ -688,7 +688,7 @@
                 <w:sz w:val="20"/>
                 <w:szCs w:val="20"/>
               </w:rPr>
-              <w:t xml:space="preserve">Kira Akdinin Başlangıç Tarihi</w:t>
+              <w:t xml:space="preserve">Kullanım Şekli</w:t>
             </w:r>
           </w:p>
         </w:tc>
@@ -708,7 +708,7 @@
                 <w:sz w:val="20"/>
                 <w:szCs w:val="20"/>
               </w:rPr>
-              <w:t xml:space="preserve">: 01.04.2025</w:t>
+              <w:t xml:space="preserve">: KONUT</w:t>
             </w:r>
           </w:p>
         </w:tc>
@@ -732,7 +732,7 @@
                 <w:sz w:val="20"/>
                 <w:szCs w:val="20"/>
               </w:rPr>
-              <w:t xml:space="preserve">Kira Müddeti</w:t>
+              <w:t xml:space="preserve">Kira Bedelinin Ödenme Şekli</w:t>
             </w:r>
           </w:p>
         </w:tc>
@@ -752,7 +752,7 @@
                 <w:sz w:val="20"/>
                 <w:szCs w:val="20"/>
               </w:rPr>
-              <w:t xml:space="preserve">: 1 YIL</w:t>
+              <w:t xml:space="preserve">: BANKA YOLU İLE PEŞİN</w:t>
             </w:r>
           </w:p>
         </w:tc>
@@ -776,7 +776,7 @@
                 <w:sz w:val="20"/>
                 <w:szCs w:val="20"/>
               </w:rPr>
-              <w:t xml:space="preserve">Kullanılanın Şimdiki Durumu</w:t>
+              <w:t xml:space="preserve">Kira Bedeli Ödeme İBAN No</w:t>
             </w:r>
           </w:p>
         </w:tc>
@@ -796,139 +796,7 @@
                 <w:sz w:val="20"/>
                 <w:szCs w:val="20"/>
               </w:rPr>
-              <w:t xml:space="preserve">:</w:t>
-            </w:r>
-          </w:p>
-        </w:tc>
-      </w:tr>
-      <w:tr>
-        <w:tc>
-          <w:tcPr>
-            <w:tcW w:type="dxa" w:w="3300"/>
-            <w:tcMar>
-              <w:top w:type="dxa" w:w="60"/>
-              <w:left w:type="dxa" w:w="110"/>
-              <w:bottom w:type="dxa" w:w="60"/>
-              <w:right w:type="dxa" w:w="110"/>
-            </w:tcMar>
-          </w:tcPr>
-          <w:p>
-            <w:r>
-              <w:rPr>
-                <w:b/>
-                <w:bCs/>
-                <w:sz w:val="20"/>
-                <w:szCs w:val="20"/>
-              </w:rPr>
-              <w:t xml:space="preserve">Kullanım Şekli</w:t>
-            </w:r>
-          </w:p>
-        </w:tc>
-        <w:tc>
-          <w:tcPr>
-            <w:tcW w:type="dxa" w:w="6446"/>
-            <w:tcMar>
-              <w:top w:type="dxa" w:w="60"/>
-              <w:left w:type="dxa" w:w="110"/>
-              <w:bottom w:type="dxa" w:w="60"/>
-              <w:right w:type="dxa" w:w="110"/>
-            </w:tcMar>
-          </w:tcPr>
-          <w:p>
-            <w:r>
-              <w:rPr>
-                <w:sz w:val="20"/>
-                <w:szCs w:val="20"/>
-              </w:rPr>
-              <w:t xml:space="preserve">: KONUT</w:t>
-            </w:r>
-          </w:p>
-        </w:tc>
-      </w:tr>
-      <w:tr>
-        <w:tc>
-          <w:tcPr>
-            <w:tcW w:type="dxa" w:w="3300"/>
-            <w:tcMar>
-              <w:top w:type="dxa" w:w="60"/>
-              <w:left w:type="dxa" w:w="110"/>
-              <w:bottom w:type="dxa" w:w="60"/>
-              <w:right w:type="dxa" w:w="110"/>
-            </w:tcMar>
-          </w:tcPr>
-          <w:p>
-            <w:r>
-              <w:rPr>
-                <w:b/>
-                <w:bCs/>
-                <w:sz w:val="20"/>
-                <w:szCs w:val="20"/>
-              </w:rPr>
-              <w:t xml:space="preserve">Kira Bedelinin Ödenme Şekli</w:t>
-            </w:r>
-          </w:p>
-        </w:tc>
-        <w:tc>
-          <w:tcPr>
-            <w:tcW w:type="dxa" w:w="6446"/>
-            <w:tcMar>
-              <w:top w:type="dxa" w:w="60"/>
-              <w:left w:type="dxa" w:w="110"/>
-              <w:bottom w:type="dxa" w:w="60"/>
-              <w:right w:type="dxa" w:w="110"/>
-            </w:tcMar>
-          </w:tcPr>
-          <w:p>
-            <w:r>
-              <w:rPr>
-                <w:sz w:val="20"/>
-                <w:szCs w:val="20"/>
-              </w:rPr>
-              <w:t xml:space="preserve">: BANKA YOLU İLE PEŞİN</w:t>
-            </w:r>
-          </w:p>
-        </w:tc>
-      </w:tr>
-      <w:tr>
-        <w:tc>
-          <w:tcPr>
-            <w:tcW w:type="dxa" w:w="3300"/>
-            <w:tcMar>
-              <w:top w:type="dxa" w:w="60"/>
-              <w:left w:type="dxa" w:w="110"/>
-              <w:bottom w:type="dxa" w:w="60"/>
-              <w:right w:type="dxa" w:w="110"/>
-            </w:tcMar>
-          </w:tcPr>
-          <w:p>
-            <w:r>
-              <w:rPr>
-                <w:b/>
-                <w:bCs/>
-                <w:sz w:val="20"/>
-                <w:szCs w:val="20"/>
-              </w:rPr>
-              <w:t xml:space="preserve">Kira Bedeli Ödeme İBAN No</w:t>
-            </w:r>
-          </w:p>
-        </w:tc>
-        <w:tc>
-          <w:tcPr>
-            <w:tcW w:type="dxa" w:w="6446"/>
-            <w:tcMar>
-              <w:top w:type="dxa" w:w="60"/>
-              <w:left w:type="dxa" w:w="110"/>
-              <w:bottom w:type="dxa" w:w="60"/>
-              <w:right w:type="dxa" w:w="110"/>
-            </w:tcMar>
-          </w:tcPr>
-          <w:p>
-            <w:r>
-              <w:rPr>
-                <w:sz w:val="20"/>
-                <w:szCs w:val="20"/>
-              </w:rPr>
-              <w:t xml:space="preserve">: TR19 0006 4000 0013 4820 3174 72</w:t>
+              <w:t xml:space="preserve">: TR59 0001 2009 5690 0001 0144 51</w:t>
             </w:r>
           </w:p>
         </w:tc>
@@ -996,14 +864,13 @@
         </w:tblBorders>
       </w:tblPr>
       <w:tblGrid>
-        <w:gridCol w:w="3248"/>
-        <w:gridCol w:w="3249"/>
-        <w:gridCol w:w="3249"/>
+        <w:gridCol w:w="4873"/>
+        <w:gridCol w:w="4873"/>
       </w:tblGrid>
       <w:tr>
         <w:tc>
           <w:tcPr>
-            <w:tcW w:type="dxa" w:w="3248"/>
+            <w:tcW w:type="dxa" w:w="4873"/>
             <w:tcBorders>
               <w:top w:val="none" w:color="FFFFFF" w:sz="0"/>
               <w:left w:val="none" w:color="FFFFFF" w:sz="0"/>
@@ -1042,7 +909,7 @@
                 <w:sz w:val="20"/>
                 <w:szCs w:val="20"/>
               </w:rPr>
-              <w:t xml:space="preserve">ABDULLAH CANSEVEN</w:t>
+              <w:t xml:space="preserve">ŞÜKRİYE NUR CANSEVEN</w:t>
             </w:r>
           </w:p>
           <w:p/>
@@ -1051,7 +918,7 @@
         </w:tc>
         <w:tc>
           <w:tcPr>
-            <w:tcW w:type="dxa" w:w="3248"/>
+            <w:tcW w:type="dxa" w:w="4873"/>
             <w:tcBorders>
               <w:top w:val="none" w:color="FFFFFF" w:sz="0"/>
               <w:left w:val="none" w:color="FFFFFF" w:sz="0"/>
@@ -1077,7 +944,7 @@
                 <w:szCs w:val="20"/>
                 <w:u w:val="single"/>
               </w:rPr>
-              <w:t xml:space="preserve">KEFİL</w:t>
+              <w:t xml:space="preserve">KİRACI</w:t>
             </w:r>
           </w:p>
           <w:p>
@@ -1090,55 +957,7 @@
                 <w:sz w:val="20"/>
                 <w:szCs w:val="20"/>
               </w:rPr>
-              <w:t xml:space="preserve">CEMRE ORTAÇ</w:t>
-            </w:r>
-          </w:p>
-          <w:p/>
-          <w:p/>
-          <w:p/>
-        </w:tc>
-        <w:tc>
-          <w:tcPr>
-            <w:tcW w:type="dxa" w:w="3248"/>
-            <w:tcBorders>
-              <w:top w:val="none" w:color="FFFFFF" w:sz="0"/>
-              <w:left w:val="none" w:color="FFFFFF" w:sz="0"/>
-              <w:bottom w:val="none" w:color="FFFFFF" w:sz="0"/>
-              <w:right w:val="none" w:color="FFFFFF" w:sz="0"/>
-            </w:tcBorders>
-            <w:tcMar>
-              <w:top w:type="dxa" w:w="60"/>
-              <w:left w:type="dxa" w:w="60"/>
-              <w:bottom w:type="dxa" w:w="60"/>
-              <w:right w:type="dxa" w:w="60"/>
-            </w:tcMar>
-          </w:tcPr>
-          <w:p>
-            <w:pPr>
-              <w:jc w:val="center"/>
-            </w:pPr>
-            <w:r>
-              <w:rPr>
-                <w:b/>
-                <w:bCs/>
-                <w:sz w:val="20"/>
-                <w:szCs w:val="20"/>
-                <w:u w:val="single"/>
-              </w:rPr>
-              <w:t xml:space="preserve">KİRACI</w:t>
-            </w:r>
-          </w:p>
-          <w:p>
-            <w:pPr>
-              <w:spacing w:before="80"/>
-              <w:jc w:val="center"/>
-            </w:pPr>
-            <w:r>
-              <w:rPr>
-                <w:sz w:val="20"/>
-                <w:szCs w:val="20"/>
-              </w:rPr>
-              <w:t xml:space="preserve">ÖMER ORTAÇ</w:t>
+              <w:t xml:space="preserve">ADEM YILDIZ</w:t>
             </w:r>
           </w:p>
           <w:p/>
@@ -1435,14 +1254,13 @@
         </w:tblBorders>
       </w:tblPr>
       <w:tblGrid>
-        <w:gridCol w:w="3248"/>
-        <w:gridCol w:w="3249"/>
-        <w:gridCol w:w="3249"/>
+        <w:gridCol w:w="4873"/>
+        <w:gridCol w:w="4873"/>
       </w:tblGrid>
       <w:tr>
         <w:tc>
           <w:tcPr>
-            <w:tcW w:type="dxa" w:w="3248"/>
+            <w:tcW w:type="dxa" w:w="4873"/>
             <w:tcBorders>
               <w:top w:val="none" w:color="FFFFFF" w:sz="0"/>
               <w:left w:val="none" w:color="FFFFFF" w:sz="0"/>
@@ -1481,7 +1299,7 @@
                 <w:sz w:val="20"/>
                 <w:szCs w:val="20"/>
               </w:rPr>
-              <w:t xml:space="preserve">ABDULLAH CANSEVEN</w:t>
+              <w:t xml:space="preserve">ŞÜKRİYE NUR CANSEVEN</w:t>
             </w:r>
           </w:p>
           <w:p/>
@@ -1490,7 +1308,7 @@
         </w:tc>
         <w:tc>
           <w:tcPr>
-            <w:tcW w:type="dxa" w:w="3248"/>
+            <w:tcW w:type="dxa" w:w="4873"/>
             <w:tcBorders>
               <w:top w:val="none" w:color="FFFFFF" w:sz="0"/>
               <w:left w:val="none" w:color="FFFFFF" w:sz="0"/>
@@ -1516,7 +1334,7 @@
                 <w:szCs w:val="20"/>
                 <w:u w:val="single"/>
               </w:rPr>
-              <w:t xml:space="preserve">KEFİL</w:t>
+              <w:t xml:space="preserve">KİRACI</w:t>
             </w:r>
           </w:p>
           <w:p>
@@ -1529,55 +1347,7 @@
                 <w:sz w:val="20"/>
                 <w:szCs w:val="20"/>
               </w:rPr>
-              <w:t xml:space="preserve">CEMRE ORTAÇ</w:t>
-            </w:r>
-          </w:p>
-          <w:p/>
-          <w:p/>
-          <w:p/>
-        </w:tc>
-        <w:tc>
-          <w:tcPr>
-            <w:tcW w:type="dxa" w:w="3248"/>
-            <w:tcBorders>
-              <w:top w:val="none" w:color="FFFFFF" w:sz="0"/>
-              <w:left w:val="none" w:color="FFFFFF" w:sz="0"/>
-              <w:bottom w:val="none" w:color="FFFFFF" w:sz="0"/>
-              <w:right w:val="none" w:color="FFFFFF" w:sz="0"/>
-            </w:tcBorders>
-            <w:tcMar>
-              <w:top w:type="dxa" w:w="60"/>
-              <w:left w:type="dxa" w:w="60"/>
-              <w:bottom w:type="dxa" w:w="60"/>
-              <w:right w:type="dxa" w:w="60"/>
-            </w:tcMar>
-          </w:tcPr>
-          <w:p>
-            <w:pPr>
-              <w:jc w:val="center"/>
-            </w:pPr>
-            <w:r>
-              <w:rPr>
-                <w:b/>
-                <w:bCs/>
-                <w:sz w:val="20"/>
-                <w:szCs w:val="20"/>
-                <w:u w:val="single"/>
-              </w:rPr>
-              <w:t xml:space="preserve">KİRACI</w:t>
-            </w:r>
-          </w:p>
-          <w:p>
-            <w:pPr>
-              <w:spacing w:before="80"/>
-              <w:jc w:val="center"/>
-            </w:pPr>
-            <w:r>
-              <w:rPr>
-                <w:sz w:val="20"/>
-                <w:szCs w:val="20"/>
-              </w:rPr>
-              <w:t xml:space="preserve">ÖMER ORTAÇ</w:t>
+              <w:t xml:space="preserve">ADEM YILDIZ</w:t>
             </w:r>
           </w:p>
           <w:p/>
@@ -1932,7 +1702,7 @@
           <w:sz w:val="20"/>
           <w:szCs w:val="20"/>
         </w:rPr>
-        <w:t xml:space="preserve">Kira ücretinin ödenmesi hususunda temerrüde düşülmesi veya ödenmemesi durumunda kira sözleşmesinde yetkilendirilen şahıs, şahsi kefalete ilişkin hükümleri kabul ve taahhüt eder. Kira sözleşmesinde yetkilendirilen şahsın kefilliği 5 yıl süre ve sözleşme başlangıç tarihi itibariyle 1 yıllık kira bedeli ile sınırlıdır.</w:t>
+        <w:t xml:space="preserve">İşbu kontratın arka sayfasındaki genel hükümler, özel hükümler ile çelişmediği takdirde aynen geçerlidir.</w:t>
       </w:r>
     </w:p>
     <w:p>
@@ -1957,31 +1727,6 @@
           <w:sz w:val="20"/>
           <w:szCs w:val="20"/>
         </w:rPr>
-        <w:t xml:space="preserve">İşbu kontratın arka sayfasındaki genel hükümler, özel hükümler ile çelişmediği takdirde aynen geçerlidir.</w:t>
-      </w:r>
-    </w:p>
-    <w:p>
-      <w:pPr>
-        <w:spacing w:after="140"/>
-        <w:ind w:left="360" w:hanging="360"/>
-        <w:jc w:val="both"/>
-      </w:pPr>
-      <w:r>
-        <w:rPr>
-          <w:b w:val="false"/>
-          <w:bCs w:val="false"/>
-          <w:sz w:val="20"/>
-          <w:szCs w:val="20"/>
-        </w:rPr>
-        <w:t xml:space="preserve">13. </w:t>
-      </w:r>
-      <w:r>
-        <w:rPr>
-          <w:b w:val="false"/>
-          <w:bCs w:val="false"/>
-          <w:sz w:val="20"/>
-          <w:szCs w:val="20"/>
-        </w:rPr>
         <w:t xml:space="preserve">Bu sözleşme, </w:t>
       </w:r>
       <w:r>
@@ -1991,7 +1736,7 @@
           <w:sz w:val="20"/>
           <w:szCs w:val="20"/>
         </w:rPr>
-        <w:t xml:space="preserve">10 Genel Koşul ve 13 Özel Koşul dahilinde 2 nüsha</w:t>
+        <w:t xml:space="preserve">10 Genel Koşul ve 12 Özel Koşul dahilinde 2 nüsha</w:t>
       </w:r>
       <w:r>
         <w:rPr>
@@ -2021,14 +1766,13 @@
         </w:tblBorders>
       </w:tblPr>
       <w:tblGrid>
-        <w:gridCol w:w="3248"/>
-        <w:gridCol w:w="3249"/>
-        <w:gridCol w:w="3249"/>
+        <w:gridCol w:w="4873"/>
+        <w:gridCol w:w="4873"/>
       </w:tblGrid>
       <w:tr>
         <w:tc>
           <w:tcPr>
-            <w:tcW w:type="dxa" w:w="3248"/>
+            <w:tcW w:type="dxa" w:w="4873"/>
             <w:tcBorders>
               <w:top w:val="none" w:color="FFFFFF" w:sz="0"/>
               <w:left w:val="none" w:color="FFFFFF" w:sz="0"/>
@@ -2067,7 +1811,7 @@
                 <w:sz w:val="20"/>
                 <w:szCs w:val="20"/>
               </w:rPr>
-              <w:t xml:space="preserve">ABDULLAH CANSEVEN</w:t>
+              <w:t xml:space="preserve">ŞÜKRİYE NUR CANSEVEN</w:t>
             </w:r>
           </w:p>
           <w:p/>
@@ -2076,7 +1820,7 @@
         </w:tc>
         <w:tc>
           <w:tcPr>
-            <w:tcW w:type="dxa" w:w="3248"/>
+            <w:tcW w:type="dxa" w:w="4873"/>
             <w:tcBorders>
               <w:top w:val="none" w:color="FFFFFF" w:sz="0"/>
               <w:left w:val="none" w:color="FFFFFF" w:sz="0"/>
@@ -2102,7 +1846,7 @@
                 <w:szCs w:val="20"/>
                 <w:u w:val="single"/>
               </w:rPr>
-              <w:t xml:space="preserve">KEFİL</w:t>
+              <w:t xml:space="preserve">KİRACI</w:t>
             </w:r>
           </w:p>
           <w:p>
@@ -2115,55 +1859,7 @@
                 <w:sz w:val="20"/>
                 <w:szCs w:val="20"/>
               </w:rPr>
-              <w:t xml:space="preserve">CEMRE ORTAÇ</w:t>
-            </w:r>
-          </w:p>
-          <w:p/>
-          <w:p/>
-          <w:p/>
-        </w:tc>
-        <w:tc>
-          <w:tcPr>
-            <w:tcW w:type="dxa" w:w="3248"/>
-            <w:tcBorders>
-              <w:top w:val="none" w:color="FFFFFF" w:sz="0"/>
-              <w:left w:val="none" w:color="FFFFFF" w:sz="0"/>
-              <w:bottom w:val="none" w:color="FFFFFF" w:sz="0"/>
-              <w:right w:val="none" w:color="FFFFFF" w:sz="0"/>
-            </w:tcBorders>
-            <w:tcMar>
-              <w:top w:type="dxa" w:w="60"/>
-              <w:left w:type="dxa" w:w="60"/>
-              <w:bottom w:type="dxa" w:w="60"/>
-              <w:right w:type="dxa" w:w="60"/>
-            </w:tcMar>
-          </w:tcPr>
-          <w:p>
-            <w:pPr>
-              <w:jc w:val="center"/>
-            </w:pPr>
-            <w:r>
-              <w:rPr>
-                <w:b/>
-                <w:bCs/>
-                <w:sz w:val="20"/>
-                <w:szCs w:val="20"/>
-                <w:u w:val="single"/>
-              </w:rPr>
-              <w:t xml:space="preserve">KİRACI</w:t>
-            </w:r>
-          </w:p>
-          <w:p>
-            <w:pPr>
-              <w:spacing w:before="80"/>
-              <w:jc w:val="center"/>
-            </w:pPr>
-            <w:r>
-              <w:rPr>
-                <w:sz w:val="20"/>
-                <w:szCs w:val="20"/>
-              </w:rPr>
-              <w:t xml:space="preserve">ÖMER ORTAÇ</w:t>
+              <w:t xml:space="preserve">ADEM YILDIZ</w:t>
             </w:r>
           </w:p>
           <w:p/>

</xml_diff>

<commit_message>
Set Kula property address, payment window 15-19, Kula courts
The rented property address is now the 4 Eylul Mah. Muammer Kelesoglu
Sokak No. 142 Daire 9 Kula/Manisa flat; the landlord's own address is
updated to Seyitali Mahallesi 189 Sokak No. 18 Kula/Manisa. Rent is
payable between the 15th and 19th of each month, and jurisdiction for
disputes moved from Izmir to Kula (Manisa) courts.

Co-Authored-By: Claude Fable 5 <noreply@anthropic.com>
Claude-Session: https://claude.ai/code/session_013ftxuMbrdNvqBfQiBmVPB5
</commit_message>
<xml_diff>
--- a/konut-kira-kontrati.docx
+++ b/konut-kira-kontrati.docx
@@ -116,7 +116,7 @@
                 <w:sz w:val="20"/>
                 <w:szCs w:val="20"/>
               </w:rPr>
-              <w:t xml:space="preserve">: 8252 SOKAK NO. 3 DAİRE 1 ATAŞEHİR MAHALLESİ ÇİĞLİ</w:t>
+              <w:t xml:space="preserve">: 4 EYLÜL MAHALLESİ MUAMMER KELEŞOĞLU SOKAK NO. 142 DAİRE 9 KULA / MANİSA</w:t>
             </w:r>
           </w:p>
         </w:tc>
@@ -312,7 +312,7 @@
                 <w:sz w:val="20"/>
                 <w:szCs w:val="20"/>
               </w:rPr>
-              <w:t xml:space="preserve">: 4 EYLÜL MAHALLESİ MUAMMER KELEŞOĞLU SOKAK NO. 142 DAİRE 9 KULA / MANİSA</w:t>
+              <w:t xml:space="preserve">: SEYİTALİ MAHALLESİ 189 SOKAK NO. 18 KULA / MANİSA</w:t>
             </w:r>
           </w:p>
         </w:tc>
@@ -1407,7 +1407,7 @@
           <w:sz w:val="20"/>
           <w:szCs w:val="20"/>
         </w:rPr>
-        <w:t xml:space="preserve">AYIN 5'İ İLE 10'U</w:t>
+        <w:t xml:space="preserve">AYIN 15'İ İLE 19'U</w:t>
       </w:r>
       <w:r>
         <w:rPr>
@@ -1745,7 +1745,7 @@
           <w:sz w:val="20"/>
           <w:szCs w:val="20"/>
         </w:rPr>
-        <w:t xml:space="preserve"> olacak şekilde imzalanmıştır. Yazılı bulunmayan hükümlere ihtiyaç duyulduğunda Türk Borçlar Kanunu, 634 sayılı Kat Mülkiyeti Kanunu ve diğer yürürlükteki alakalı kanun ve yerleşmiş Yargıtay kararları uygulanır. İşbu kira sözleşmesinden doğacak her türlü uyuşmazlıklarda İzmir Mahkemeleri ve İcra Daireleri yetkilidir.</w:t>
+        <w:t xml:space="preserve"> olacak şekilde imzalanmıştır. Yazılı bulunmayan hükümlere ihtiyaç duyulduğunda Türk Borçlar Kanunu, 634 sayılı Kat Mülkiyeti Kanunu ve diğer yürürlükteki alakalı kanun ve yerleşmiş Yargıtay kararları uygulanır. İşbu kira sözleşmesinden doğacak her türlü uyuşmazlıklarda Kula (Manisa) Mahkemeleri ve İcra Daireleri yetkilidir.</w:t>
       </w:r>
     </w:p>
     <w:p>

</xml_diff>

<commit_message>
Remove leading colons from front page value cells
Co-Authored-By: Claude Fable 5 <noreply@anthropic.com>
Claude-Session: https://claude.ai/code/session_013ftxuMbrdNvqBfQiBmVPB5
</commit_message>
<xml_diff>
--- a/konut-kira-kontrati.docx
+++ b/konut-kira-kontrati.docx
@@ -72,7 +72,7 @@
                 <w:sz w:val="20"/>
                 <w:szCs w:val="20"/>
               </w:rPr>
-              <w:t xml:space="preserve">: KULA</w:t>
+              <w:t xml:space="preserve">KULA</w:t>
             </w:r>
           </w:p>
         </w:tc>
@@ -116,7 +116,7 @@
                 <w:sz w:val="20"/>
                 <w:szCs w:val="20"/>
               </w:rPr>
-              <w:t xml:space="preserve">: 4 EYLÜL MAHALLESİ MUAMMER KELEŞOĞLU SOKAK NO. 142 DAİRE 9 KULA / MANİSA</w:t>
+              <w:t xml:space="preserve">4 EYLÜL MAHALLESİ MUAMMER KELEŞOĞLU SOKAK NO. 142 DAİRE 9 KULA / MANİSA</w:t>
             </w:r>
           </w:p>
         </w:tc>
@@ -160,7 +160,7 @@
                 <w:sz w:val="20"/>
                 <w:szCs w:val="20"/>
               </w:rPr>
-              <w:t xml:space="preserve">:</w:t>
+              <w:t xml:space="preserve"/>
             </w:r>
           </w:p>
         </w:tc>
@@ -215,16 +215,16 @@
                 <w:sz w:val="20"/>
                 <w:szCs w:val="20"/>
               </w:rPr>
-              <w:t xml:space="preserve">: ŞÜKRİYE NUR CANSEVEN</w:t>
-            </w:r>
-          </w:p>
-          <w:p>
-            <w:r>
-              <w:rPr>
-                <w:sz w:val="20"/>
-                <w:szCs w:val="20"/>
-              </w:rPr>
-              <w:t xml:space="preserve">  TC. 21875415058</w:t>
+              <w:t xml:space="preserve">ŞÜKRİYE NUR CANSEVEN</w:t>
+            </w:r>
+          </w:p>
+          <w:p>
+            <w:r>
+              <w:rPr>
+                <w:sz w:val="20"/>
+                <w:szCs w:val="20"/>
+              </w:rPr>
+              <w:t xml:space="preserve">TC. 21875415058</w:t>
             </w:r>
           </w:p>
         </w:tc>
@@ -268,7 +268,7 @@
                 <w:sz w:val="20"/>
                 <w:szCs w:val="20"/>
               </w:rPr>
-              <w:t xml:space="preserve">: +90 546 267 2767</w:t>
+              <w:t xml:space="preserve">+90 546 267 2767</w:t>
             </w:r>
           </w:p>
         </w:tc>
@@ -312,7 +312,7 @@
                 <w:sz w:val="20"/>
                 <w:szCs w:val="20"/>
               </w:rPr>
-              <w:t xml:space="preserve">: SEYİTALİ MAHALLESİ 189 SOKAK NO. 18 KULA / MANİSA</w:t>
+              <w:t xml:space="preserve">SEYİTALİ MAHALLESİ 189 SOKAK NO. 18 KULA / MANİSA</w:t>
             </w:r>
           </w:p>
         </w:tc>
@@ -356,7 +356,7 @@
                 <w:sz w:val="20"/>
                 <w:szCs w:val="20"/>
               </w:rPr>
-              <w:t xml:space="preserve">: ADEM YILDIZ – TC. 38143526484</w:t>
+              <w:t xml:space="preserve">ADEM YILDIZ – TC. 38143526484</w:t>
             </w:r>
           </w:p>
         </w:tc>
@@ -400,7 +400,7 @@
                 <w:sz w:val="20"/>
                 <w:szCs w:val="20"/>
               </w:rPr>
-              <w:t xml:space="preserve">: ATAKENT MAH. 3289. SOKAK NO. 26 K: 4 D: 7 ATAKUM / SAMSUN</w:t>
+              <w:t xml:space="preserve">ATAKENT MAH. 3289. SOKAK NO. 26 K: 4 D: 7 ATAKUM / SAMSUN</w:t>
             </w:r>
           </w:p>
         </w:tc>
@@ -444,7 +444,7 @@
                 <w:sz w:val="20"/>
                 <w:szCs w:val="20"/>
               </w:rPr>
-              <w:t xml:space="preserve">: 15.000 TL</w:t>
+              <w:t xml:space="preserve">15.000 TL</w:t>
             </w:r>
           </w:p>
         </w:tc>
@@ -488,7 +488,7 @@
                 <w:sz w:val="20"/>
                 <w:szCs w:val="20"/>
               </w:rPr>
-              <w:t xml:space="preserve">: 180.000 TL</w:t>
+              <w:t xml:space="preserve">180.000 TL</w:t>
             </w:r>
           </w:p>
         </w:tc>
@@ -532,7 +532,7 @@
                 <w:sz w:val="20"/>
                 <w:szCs w:val="20"/>
               </w:rPr>
-              <w:t xml:space="preserve">: 15.000 TL</w:t>
+              <w:t xml:space="preserve">15.000 TL</w:t>
             </w:r>
           </w:p>
         </w:tc>
@@ -576,7 +576,7 @@
                 <w:sz w:val="20"/>
                 <w:szCs w:val="20"/>
               </w:rPr>
-              <w:t xml:space="preserve">:</w:t>
+              <w:t xml:space="preserve"/>
             </w:r>
           </w:p>
         </w:tc>
@@ -620,7 +620,7 @@
                 <w:sz w:val="20"/>
                 <w:szCs w:val="20"/>
               </w:rPr>
-              <w:t xml:space="preserve">: 1 YIL</w:t>
+              <w:t xml:space="preserve">1 YIL</w:t>
             </w:r>
           </w:p>
         </w:tc>
@@ -664,7 +664,7 @@
                 <w:sz w:val="20"/>
                 <w:szCs w:val="20"/>
               </w:rPr>
-              <w:t xml:space="preserve">:</w:t>
+              <w:t xml:space="preserve"/>
             </w:r>
           </w:p>
         </w:tc>
@@ -708,7 +708,7 @@
                 <w:sz w:val="20"/>
                 <w:szCs w:val="20"/>
               </w:rPr>
-              <w:t xml:space="preserve">: KONUT</w:t>
+              <w:t xml:space="preserve">KONUT</w:t>
             </w:r>
           </w:p>
         </w:tc>
@@ -752,7 +752,7 @@
                 <w:sz w:val="20"/>
                 <w:szCs w:val="20"/>
               </w:rPr>
-              <w:t xml:space="preserve">: BANKA YOLU İLE PEŞİN</w:t>
+              <w:t xml:space="preserve">BANKA YOLU İLE PEŞİN</w:t>
             </w:r>
           </w:p>
         </w:tc>
@@ -796,7 +796,7 @@
                 <w:sz w:val="20"/>
                 <w:szCs w:val="20"/>
               </w:rPr>
-              <w:t xml:space="preserve">: TR59 0001 2009 5690 0001 0144 51</w:t>
+              <w:t xml:space="preserve">TR59 0001 2009 5690 0001 0144 51</w:t>
             </w:r>
           </w:p>
         </w:tc>
@@ -840,7 +840,7 @@
                 <w:sz w:val="20"/>
                 <w:szCs w:val="20"/>
               </w:rPr>
-              <w:t xml:space="preserve">: KOMBİ</w:t>
+              <w:t xml:space="preserve">KOMBİ</w:t>
             </w:r>
           </w:p>
         </w:tc>

</xml_diff>

<commit_message>
Cap rent increase at annual CPI, set start date and payment window
The increase clause still indexes to the cumulative civil-servant
raise (January + July) but now caps the applied increase at the
annual CPI (TUFE) rate whenever the raise exceeds it. Lease start
date set to 01.10.2026 and the monthly payment window moved to the
1st-5th of each month.

Co-Authored-By: Claude Fable 5 <noreply@anthropic.com>
Claude-Session: https://claude.ai/code/session_013ftxuMbrdNvqBfQiBmVPB5
</commit_message>
<xml_diff>
--- a/konut-kira-kontrati.docx
+++ b/konut-kira-kontrati.docx
@@ -576,7 +576,7 @@
                 <w:sz w:val="20"/>
                 <w:szCs w:val="20"/>
               </w:rPr>
-              <w:t xml:space="preserve"/>
+              <w:t xml:space="preserve">01.10.2026</w:t>
             </w:r>
           </w:p>
         </w:tc>
@@ -1407,7 +1407,7 @@
           <w:sz w:val="20"/>
           <w:szCs w:val="20"/>
         </w:rPr>
-        <w:t xml:space="preserve">AYIN 15'İ İLE 19'U</w:t>
+        <w:t xml:space="preserve">AYIN 1'İ İLE 5'İ</w:t>
       </w:r>
       <w:r>
         <w:rPr>
@@ -1459,7 +1459,25 @@
           <w:sz w:val="20"/>
           <w:szCs w:val="20"/>
         </w:rPr>
-        <w:t xml:space="preserve"> esas alınarak zam yapılacak ve yeni dönem kirası belirlenecektir. Kira akdi uzayan her yıl için bu şekilde hesaplama yapılacaktır. İşbu madde ihtarname yerine kaimdir. Ancak kira dönemini takip eden her beşinci yılın sonunda kira bedeli, yukarıdaki esaslar çerçevesinde hesap edilen miktardan aşağı olmamak koşulu ile emsal ve rayiç durumuna göre yeniden tespit edilecektir.</w:t>
+        <w:t xml:space="preserve"> esas alınarak zam yapılacak ve yeni dönem kirası belirlenecektir. </w:t>
+      </w:r>
+      <w:r>
+        <w:rPr>
+          <w:b/>
+          <w:bCs/>
+          <w:sz w:val="20"/>
+          <w:szCs w:val="20"/>
+        </w:rPr>
+        <w:t xml:space="preserve">Ancak memur maaş zammı toplam oranının yıllık Tüketici Fiyat Endeksi (TÜFE) artış oranını aştığı durumlarda, o yıl uygulanacak azami zam oranı yıllık TÜFE artış oranıdır.</w:t>
+      </w:r>
+      <w:r>
+        <w:rPr>
+          <w:b w:val="false"/>
+          <w:bCs w:val="false"/>
+          <w:sz w:val="20"/>
+          <w:szCs w:val="20"/>
+        </w:rPr>
+        <w:t xml:space="preserve"> Kira akdi uzayan her yıl için bu şekilde hesaplama yapılacaktır. İşbu madde ihtarname yerine kaimdir. Ancak kira dönemini takip eden her beşinci yılın sonunda kira bedeli, yukarıdaki esaslar çerçevesinde hesap edilen miktardan aşağı olmamak koşulu ile emsal ve rayiç durumuna göre yeniden tespit edilecektir.</w:t>
       </w:r>
     </w:p>
     <w:p>

</xml_diff>